<commit_message>
Workshop-Unterlagen und Vorab-Mail aktualisiert: Stilregeln, Textarten, keine langen Gedankenstriche, Namenskorrektur im Einführungsgespräch
Co-Authored-By: Claude Sonnet 5.5 <noreply@anthropic.com>
</commit_message>
<xml_diff>
--- a/rhetoriq-app/server/templates/workshop/RhetorIQ_Einfuehrungsgespraech.docx
+++ b/rhetoriq-app/server/templates/workshop/RhetorIQ_Einfuehrungsgespraech.docx
@@ -148,7 +148,7 @@
                 <w:sz w:val="20"/>
                 <w:szCs w:val="20"/>
               </w:rPr>
-              <w:t xml:space="preserve">RhetorIQ ist Ihr KI-gestützter Kommunikationsassistent. Er lernt Ihren Stil, Ihre Branche und Ihre Ziele — und generiert Texte, Analysen und Vorbereitungen, die klingen wie Sie.</w:t>
+              <w:t xml:space="preserve">RhetorIQ ist Ihr KI-gestützter Kommunikationsassistent. Er lernt Ihren Stil, Ihre Branche und Ihre Ziele, und generiert Texte, Analysen und Vorbereitungen, die klingen wie Sie.</w:t>
             </w:r>
           </w:p>
           <w:p>
@@ -167,7 +167,7 @@
                 <w:sz w:val="20"/>
                 <w:szCs w:val="20"/>
               </w:rPr>
-              <w:t xml:space="preserve">Jeder Klient startet mit einer Brand Voice — dem Kommunikations-DNA-Profil, das bei jedem Modul im Hintergrund wirkt. Darauf aufbauend wählen wir gemeinsam die Module, die zu Ihren häufigsten Kommunikationssituationen passen.</w:t>
+              <w:t xml:space="preserve">Jeder Klient startet mit einer Brand Voice, dem Kommunikations-DNA-Profil, das bei jedem Modul im Hintergrund wirkt. Darauf aufbauend wählen wir gemeinsam die Module, die zu Ihren häufigsten Kommunikationssituationen passen.</w:t>
             </w:r>
           </w:p>
         </w:tc>
@@ -263,7 +263,7 @@
           <w:sz w:val="20"/>
           <w:szCs w:val="20"/>
         </w:rPr>
-        <w:t xml:space="preserve">Die folgende Übersicht zeigt alle verfügbaren Module mit ihrer Funktion. Brand Voice ist immer dabei — die anderen werden gemeinsam ausgewählt.</w:t>
+        <w:t xml:space="preserve">Die folgende Übersicht zeigt alle verfügbaren Module mit ihrer Funktion. Brand Voice ist immer dabei, die anderen werden gemeinsam ausgewählt. In der Plattform sind Meeting-Vorbereitung, Einwand-Training und Debrief unter «Gespräch» gebündelt.</w:t>
       </w:r>
     </w:p>
     <w:tbl>
@@ -488,7 +488,7 @@
                 <w:sz w:val="18"/>
                 <w:szCs w:val="18"/>
               </w:rPr>
-              <w:t xml:space="preserve">Definiert den einzigartigen Kommunikationsstil — wird bei jedem Modul injiziert.</w:t>
+              <w:t xml:space="preserve">Definiert den einzigartigen Kommunikationsstil, wird bei jedem Modul injiziert.</w:t>
             </w:r>
           </w:p>
         </w:tc>
@@ -746,7 +746,7 @@
                 <w:sz w:val="18"/>
                 <w:szCs w:val="18"/>
               </w:rPr>
-              <w:t xml:space="preserve">Verbessert bestehende Texte — macht sie klarer, wärmer oder wirkungsvoller.</w:t>
+              <w:t xml:space="preserve">Verbessert bestehende Texte, macht sie klarer, wärmer oder wirkungsvoller.</w:t>
             </w:r>
           </w:p>
         </w:tc>
@@ -1133,7 +1133,7 @@
                 <w:sz w:val="18"/>
                 <w:szCs w:val="18"/>
               </w:rPr>
-              <w:t xml:space="preserve">Bereitet auf ein konkretes Gespräch vor — mit Botschaften, Einwänden, Taktik.</w:t>
+              <w:t xml:space="preserve">Bereitet auf ein konkretes Gespräch vor, mit Botschaften, Einwänden, Taktik.</w:t>
             </w:r>
           </w:p>
         </w:tc>
@@ -1300,7 +1300,7 @@
                 <w:sz w:val="18"/>
                 <w:szCs w:val="18"/>
               </w:rPr>
-              <w:t xml:space="preserve">Führungskräfte, Coaches, HR — überall wo Feedback geschrieben wird.</w:t>
+              <w:t xml:space="preserve">Führungskräfte, Coaches, HR, überall wo Feedback geschrieben wird.</w:t>
             </w:r>
           </w:p>
         </w:tc>
@@ -1391,7 +1391,7 @@
                 <w:sz w:val="18"/>
                 <w:szCs w:val="18"/>
               </w:rPr>
-              <w:t xml:space="preserve">Formuliert persönliche Dankesnachrichten und Anerkennung — echt, nicht generisch.</w:t>
+              <w:t xml:space="preserve">Formuliert persönliche Dankesnachrichten und Anerkennung, echt und persönlich.</w:t>
             </w:r>
           </w:p>
         </w:tc>
@@ -1907,7 +1907,7 @@
                 <w:sz w:val="18"/>
                 <w:szCs w:val="18"/>
               </w:rPr>
-              <w:t xml:space="preserve">Simuliert kritische Gegenfragen — übt Antworten auf schwierige Situationen.</w:t>
+              <w:t xml:space="preserve">Simuliert kritische Gegenfragen, übt Antworten auf schwierige Situationen.</w:t>
             </w:r>
           </w:p>
         </w:tc>
@@ -2036,7 +2036,7 @@
                 <w:sz w:val="18"/>
                 <w:szCs w:val="18"/>
               </w:rPr>
-              <w:t xml:space="preserve">Strukturiert die Reflexion nach einem Gespräch — was lief gut, was verbessern.</w:t>
+              <w:t xml:space="preserve">Strukturiert die Reflexion nach einem Gespräch, was lief gut, was verbessern.</w:t>
             </w:r>
           </w:p>
         </w:tc>
@@ -2472,7 +2472,7 @@
                 <w:sz w:val="17"/>
                 <w:szCs w:val="17"/>
               </w:rPr>
-              <w:t xml:space="preserve">Definiert den einzigartigen Kommunikationsstil — wird bei jedem Modul injiziert.</w:t>
+              <w:t xml:space="preserve">Definiert den einzigartigen Kommunikationsstil, wird bei jedem Modul injiziert.</w:t>
             </w:r>
           </w:p>
         </w:tc>
@@ -2730,7 +2730,7 @@
                 <w:sz w:val="17"/>
                 <w:szCs w:val="17"/>
               </w:rPr>
-              <w:t xml:space="preserve">Verbessert bestehende Texte — macht sie klarer, wärmer oder wirkungsvoller.</w:t>
+              <w:t xml:space="preserve">Verbessert bestehende Texte, macht sie klarer, wärmer oder wirkungsvoller.</w:t>
             </w:r>
           </w:p>
         </w:tc>
@@ -3026,7 +3026,7 @@
                 <w:sz w:val="17"/>
                 <w:szCs w:val="17"/>
               </w:rPr>
-              <w:t xml:space="preserve">Führungskräfte, Coaches, HR — überall wo Feedback geschrieben wird.</w:t>
+              <w:t xml:space="preserve">Führungskräfte, Coaches, HR, überall wo Feedback geschrieben wird.</w:t>
             </w:r>
           </w:p>
         </w:tc>
@@ -3117,7 +3117,7 @@
                 <w:sz w:val="17"/>
                 <w:szCs w:val="17"/>
               </w:rPr>
-              <w:t xml:space="preserve">Formuliert persönliche Dankesnachrichten und Anerkennung — echt, nicht generisch.</w:t>
+              <w:t xml:space="preserve">Formuliert persönliche Dankesnachrichten und Anerkennung, echt und persönlich.</w:t>
             </w:r>
           </w:p>
         </w:tc>
@@ -3246,7 +3246,7 @@
                 <w:sz w:val="17"/>
                 <w:szCs w:val="17"/>
               </w:rPr>
-              <w:t xml:space="preserve">Bereitet auf ein konkretes Gespräch vor — mit Botschaften, Einwänden, Taktik.</w:t>
+              <w:t xml:space="preserve">Bereitet auf ein konkretes Gespräch vor, mit Botschaften, Einwänden, Taktik.</w:t>
             </w:r>
           </w:p>
         </w:tc>
@@ -3701,7 +3701,7 @@
           <w:sz w:val="20"/>
           <w:szCs w:val="20"/>
         </w:rPr>
-        <w:t xml:space="preserve">Module für diesen Klienten — Auswahl im Gespräch</w:t>
+        <w:t xml:space="preserve">Module für diesen Klienten: Auswahl im Gespräch</w:t>
       </w:r>
     </w:p>
     <w:tbl>
@@ -4550,7 +4550,7 @@
                 <w:sz w:val="17"/>
                 <w:szCs w:val="17"/>
               </w:rPr>
-              <w:t xml:space="preserve">Definiert den einzigartigen Kommunikationsstil — wird bei jedem Modul injiziert.</w:t>
+              <w:t xml:space="preserve">Definiert den einzigartigen Kommunikationsstil, wird bei jedem Modul injiziert.</w:t>
             </w:r>
           </w:p>
         </w:tc>
@@ -4808,7 +4808,7 @@
                 <w:sz w:val="17"/>
                 <w:szCs w:val="17"/>
               </w:rPr>
-              <w:t xml:space="preserve">Verbessert bestehende Texte — macht sie klarer, wärmer oder wirkungsvoller.</w:t>
+              <w:t xml:space="preserve">Verbessert bestehende Texte, macht sie klarer, wärmer oder wirkungsvoller.</w:t>
             </w:r>
           </w:p>
         </w:tc>
@@ -5362,7 +5362,7 @@
                 <w:sz w:val="17"/>
                 <w:szCs w:val="17"/>
               </w:rPr>
-              <w:t xml:space="preserve">Führungskräfte, Coaches, HR — überall wo Feedback geschrieben wird.</w:t>
+              <w:t xml:space="preserve">Führungskräfte, Coaches, HR, überall wo Feedback geschrieben wird.</w:t>
             </w:r>
           </w:p>
         </w:tc>
@@ -5453,7 +5453,7 @@
                 <w:sz w:val="17"/>
                 <w:szCs w:val="17"/>
               </w:rPr>
-              <w:t xml:space="preserve">Formuliert persönliche Dankesnachrichten und Anerkennung — echt, nicht generisch.</w:t>
+              <w:t xml:space="preserve">Formuliert persönliche Dankesnachrichten und Anerkennung, echt und persönlich.</w:t>
             </w:r>
           </w:p>
         </w:tc>
@@ -5582,7 +5582,7 @@
                 <w:sz w:val="17"/>
                 <w:szCs w:val="17"/>
               </w:rPr>
-              <w:t xml:space="preserve">Bereitet auf ein konkretes Gespräch vor — mit Botschaften, Einwänden, Taktik.</w:t>
+              <w:t xml:space="preserve">Bereitet auf ein konkretes Gespräch vor, mit Botschaften, Einwänden, Taktik.</w:t>
             </w:r>
           </w:p>
         </w:tc>
@@ -5711,7 +5711,7 @@
                 <w:sz w:val="17"/>
                 <w:szCs w:val="17"/>
               </w:rPr>
-              <w:t xml:space="preserve">Simuliert kritische Gegenfragen — übt Antworten auf schwierige Situationen.</w:t>
+              <w:t xml:space="preserve">Simuliert kritische Gegenfragen, übt Antworten auf schwierige Situationen.</w:t>
             </w:r>
           </w:p>
         </w:tc>
@@ -5840,7 +5840,7 @@
                 <w:sz w:val="17"/>
                 <w:szCs w:val="17"/>
               </w:rPr>
-              <w:t xml:space="preserve">Strukturiert die Reflexion nach einem Gespräch — was lief gut, was verbessern.</w:t>
+              <w:t xml:space="preserve">Strukturiert die Reflexion nach einem Gespräch, was lief gut, was verbessern.</w:t>
             </w:r>
           </w:p>
         </w:tc>
@@ -5908,7 +5908,7 @@
           <w:sz w:val="20"/>
           <w:szCs w:val="20"/>
         </w:rPr>
-        <w:t xml:space="preserve">Module für diesen Klienten — Auswahl im Gespräch</w:t>
+        <w:t xml:space="preserve">Module für diesen Klienten: Auswahl im Gespräch</w:t>
       </w:r>
     </w:p>
     <w:tbl>
@@ -6826,7 +6826,7 @@
                 <w:sz w:val="17"/>
                 <w:szCs w:val="17"/>
               </w:rPr>
-              <w:t xml:space="preserve">Definiert den einzigartigen Kommunikationsstil — wird bei jedem Modul injiziert.</w:t>
+              <w:t xml:space="preserve">Definiert den einzigartigen Kommunikationsstil, wird bei jedem Modul injiziert.</w:t>
             </w:r>
           </w:p>
         </w:tc>
@@ -7509,7 +7509,7 @@
                 <w:sz w:val="17"/>
                 <w:szCs w:val="17"/>
               </w:rPr>
-              <w:t xml:space="preserve">Führungskräfte, Coaches, HR — überall wo Feedback geschrieben wird.</w:t>
+              <w:t xml:space="preserve">Führungskräfte, Coaches, HR, überall wo Feedback geschrieben wird.</w:t>
             </w:r>
           </w:p>
         </w:tc>
@@ -7600,7 +7600,7 @@
                 <w:sz w:val="17"/>
                 <w:szCs w:val="17"/>
               </w:rPr>
-              <w:t xml:space="preserve">Bereitet auf ein konkretes Gespräch vor — mit Botschaften, Einwänden, Taktik.</w:t>
+              <w:t xml:space="preserve">Bereitet auf ein konkretes Gespräch vor, mit Botschaften, Einwänden, Taktik.</w:t>
             </w:r>
           </w:p>
         </w:tc>
@@ -7858,7 +7858,7 @@
                 <w:sz w:val="17"/>
                 <w:szCs w:val="17"/>
               </w:rPr>
-              <w:t xml:space="preserve">Simuliert kritische Gegenfragen — übt Antworten auf schwierige Situationen.</w:t>
+              <w:t xml:space="preserve">Simuliert kritische Gegenfragen, übt Antworten auf schwierige Situationen.</w:t>
             </w:r>
           </w:p>
         </w:tc>
@@ -7926,7 +7926,7 @@
           <w:sz w:val="20"/>
           <w:szCs w:val="20"/>
         </w:rPr>
-        <w:t xml:space="preserve">Module für diesen Klienten — Auswahl im Gespräch</w:t>
+        <w:t xml:space="preserve">Module für diesen Klienten: Auswahl im Gespräch</w:t>
       </w:r>
     </w:p>
     <w:tbl>
@@ -8749,7 +8749,7 @@
                 <w:sz w:val="17"/>
                 <w:szCs w:val="17"/>
               </w:rPr>
-              <w:t xml:space="preserve">Definiert den einzigartigen Kommunikationsstil — wird bei jedem Modul injiziert.</w:t>
+              <w:t xml:space="preserve">Definiert den einzigartigen Kommunikationsstil, wird bei jedem Modul injiziert.</w:t>
             </w:r>
           </w:p>
         </w:tc>
@@ -9007,7 +9007,7 @@
                 <w:sz w:val="17"/>
                 <w:szCs w:val="17"/>
               </w:rPr>
-              <w:t xml:space="preserve">Verbessert bestehende Texte — macht sie klarer, wärmer oder wirkungsvoller.</w:t>
+              <w:t xml:space="preserve">Verbessert bestehende Texte, macht sie klarer, wärmer oder wirkungsvoller.</w:t>
             </w:r>
           </w:p>
         </w:tc>
@@ -9303,7 +9303,7 @@
                 <w:sz w:val="17"/>
                 <w:szCs w:val="17"/>
               </w:rPr>
-              <w:t xml:space="preserve">Führungskräfte, Coaches, HR — überall wo Feedback geschrieben wird.</w:t>
+              <w:t xml:space="preserve">Führungskräfte, Coaches, HR, überall wo Feedback geschrieben wird.</w:t>
             </w:r>
           </w:p>
         </w:tc>
@@ -9394,7 +9394,7 @@
                 <w:sz w:val="17"/>
                 <w:szCs w:val="17"/>
               </w:rPr>
-              <w:t xml:space="preserve">Formuliert persönliche Dankesnachrichten und Anerkennung — echt, nicht generisch.</w:t>
+              <w:t xml:space="preserve">Formuliert persönliche Dankesnachrichten und Anerkennung, echt und persönlich.</w:t>
             </w:r>
           </w:p>
         </w:tc>
@@ -9523,7 +9523,7 @@
                 <w:sz w:val="17"/>
                 <w:szCs w:val="17"/>
               </w:rPr>
-              <w:t xml:space="preserve">Bereitet auf ein konkretes Gespräch vor — mit Botschaften, Einwänden, Taktik.</w:t>
+              <w:t xml:space="preserve">Bereitet auf ein konkretes Gespräch vor, mit Botschaften, Einwänden, Taktik.</w:t>
             </w:r>
           </w:p>
         </w:tc>
@@ -9720,7 +9720,7 @@
           <w:sz w:val="20"/>
           <w:szCs w:val="20"/>
         </w:rPr>
-        <w:t xml:space="preserve">Module für diesen Klienten — Auswahl im Gespräch</w:t>
+        <w:t xml:space="preserve">Module für diesen Klienten: Auswahl im Gespräch</w:t>
       </w:r>
     </w:p>
     <w:tbl>
@@ -10474,7 +10474,7 @@
                 <w:sz w:val="17"/>
                 <w:szCs w:val="17"/>
               </w:rPr>
-              <w:t xml:space="preserve">Definiert den einzigartigen Kommunikationsstil — wird bei jedem Modul injiziert.</w:t>
+              <w:t xml:space="preserve">Definiert den einzigartigen Kommunikationsstil, wird bei jedem Modul injiziert.</w:t>
             </w:r>
           </w:p>
         </w:tc>
@@ -10732,7 +10732,7 @@
                 <w:sz w:val="17"/>
                 <w:szCs w:val="17"/>
               </w:rPr>
-              <w:t xml:space="preserve">Verbessert bestehende Texte — macht sie klarer, wärmer oder wirkungsvoller.</w:t>
+              <w:t xml:space="preserve">Verbessert bestehende Texte, macht sie klarer, wärmer oder wirkungsvoller.</w:t>
             </w:r>
           </w:p>
         </w:tc>
@@ -11157,7 +11157,7 @@
                 <w:sz w:val="17"/>
                 <w:szCs w:val="17"/>
               </w:rPr>
-              <w:t xml:space="preserve">Führungskräfte, Coaches, HR — überall wo Feedback geschrieben wird.</w:t>
+              <w:t xml:space="preserve">Führungskräfte, Coaches, HR, überall wo Feedback geschrieben wird.</w:t>
             </w:r>
           </w:p>
         </w:tc>
@@ -11248,7 +11248,7 @@
                 <w:sz w:val="17"/>
                 <w:szCs w:val="17"/>
               </w:rPr>
-              <w:t xml:space="preserve">Formuliert persönliche Dankesnachrichten und Anerkennung — echt, nicht generisch.</w:t>
+              <w:t xml:space="preserve">Formuliert persönliche Dankesnachrichten und Anerkennung, echt und persönlich.</w:t>
             </w:r>
           </w:p>
         </w:tc>
@@ -11377,7 +11377,7 @@
                 <w:sz w:val="17"/>
                 <w:szCs w:val="17"/>
               </w:rPr>
-              <w:t xml:space="preserve">Bereitet auf ein konkretes Gespräch vor — mit Botschaften, Einwänden, Taktik.</w:t>
+              <w:t xml:space="preserve">Bereitet auf ein konkretes Gespräch vor, mit Botschaften, Einwänden, Taktik.</w:t>
             </w:r>
           </w:p>
         </w:tc>
@@ -11445,7 +11445,7 @@
           <w:sz w:val="20"/>
           <w:szCs w:val="20"/>
         </w:rPr>
-        <w:t xml:space="preserve">Module für diesen Klienten — Auswahl im Gespräch</w:t>
+        <w:t xml:space="preserve">Module für diesen Klienten: Auswahl im Gespräch</w:t>
       </w:r>
     </w:p>
     <w:tbl>
@@ -12199,7 +12199,7 @@
                 <w:sz w:val="17"/>
                 <w:szCs w:val="17"/>
               </w:rPr>
-              <w:t xml:space="preserve">Definiert den einzigartigen Kommunikationsstil — wird bei jedem Modul injiziert.</w:t>
+              <w:t xml:space="preserve">Definiert den einzigartigen Kommunikationsstil, wird bei jedem Modul injiziert.</w:t>
             </w:r>
           </w:p>
         </w:tc>
@@ -12457,7 +12457,7 @@
                 <w:sz w:val="17"/>
                 <w:szCs w:val="17"/>
               </w:rPr>
-              <w:t xml:space="preserve">Verbessert bestehende Texte — macht sie klarer, wärmer oder wirkungsvoller.</w:t>
+              <w:t xml:space="preserve">Verbessert bestehende Texte, macht sie klarer, wärmer oder wirkungsvoller.</w:t>
             </w:r>
           </w:p>
         </w:tc>
@@ -13011,7 +13011,7 @@
                 <w:sz w:val="17"/>
                 <w:szCs w:val="17"/>
               </w:rPr>
-              <w:t xml:space="preserve">Führungskräfte, Coaches, HR — überall wo Feedback geschrieben wird.</w:t>
+              <w:t xml:space="preserve">Führungskräfte, Coaches, HR, überall wo Feedback geschrieben wird.</w:t>
             </w:r>
           </w:p>
         </w:tc>
@@ -13102,7 +13102,7 @@
                 <w:sz w:val="17"/>
                 <w:szCs w:val="17"/>
               </w:rPr>
-              <w:t xml:space="preserve">Bereitet auf ein konkretes Gespräch vor — mit Botschaften, Einwänden, Taktik.</w:t>
+              <w:t xml:space="preserve">Bereitet auf ein konkretes Gespräch vor, mit Botschaften, Einwänden, Taktik.</w:t>
             </w:r>
           </w:p>
         </w:tc>
@@ -13618,7 +13618,7 @@
                 <w:sz w:val="17"/>
                 <w:szCs w:val="17"/>
               </w:rPr>
-              <w:t xml:space="preserve">Simuliert kritische Gegenfragen — übt Antworten auf schwierige Situationen.</w:t>
+              <w:t xml:space="preserve">Simuliert kritische Gegenfragen, übt Antworten auf schwierige Situationen.</w:t>
             </w:r>
           </w:p>
         </w:tc>
@@ -13686,7 +13686,7 @@
           <w:sz w:val="20"/>
           <w:szCs w:val="20"/>
         </w:rPr>
-        <w:t xml:space="preserve">Module für diesen Klienten — Auswahl im Gespräch</w:t>
+        <w:t xml:space="preserve">Module für diesen Klienten: Auswahl im Gespräch</w:t>
       </w:r>
     </w:p>
     <w:tbl>
@@ -14630,7 +14630,7 @@
                 <w:sz w:val="17"/>
                 <w:szCs w:val="17"/>
               </w:rPr>
-              <w:t xml:space="preserve">Definiert den einzigartigen Kommunikationsstil — wird bei jedem Modul injiziert.</w:t>
+              <w:t xml:space="preserve">Definiert den einzigartigen Kommunikationsstil, wird bei jedem Modul injiziert.</w:t>
             </w:r>
           </w:p>
         </w:tc>
@@ -14888,7 +14888,7 @@
                 <w:sz w:val="17"/>
                 <w:szCs w:val="17"/>
               </w:rPr>
-              <w:t xml:space="preserve">Verbessert bestehende Texte — macht sie klarer, wärmer oder wirkungsvoller.</w:t>
+              <w:t xml:space="preserve">Verbessert bestehende Texte, macht sie klarer, wärmer oder wirkungsvoller.</w:t>
             </w:r>
           </w:p>
         </w:tc>
@@ -15313,7 +15313,7 @@
                 <w:sz w:val="17"/>
                 <w:szCs w:val="17"/>
               </w:rPr>
-              <w:t xml:space="preserve">Führungskräfte, Coaches, HR — überall wo Feedback geschrieben wird.</w:t>
+              <w:t xml:space="preserve">Führungskräfte, Coaches, HR, überall wo Feedback geschrieben wird.</w:t>
             </w:r>
           </w:p>
         </w:tc>
@@ -15404,7 +15404,7 @@
                 <w:sz w:val="17"/>
                 <w:szCs w:val="17"/>
               </w:rPr>
-              <w:t xml:space="preserve">Formuliert persönliche Dankesnachrichten und Anerkennung — echt, nicht generisch.</w:t>
+              <w:t xml:space="preserve">Formuliert persönliche Dankesnachrichten und Anerkennung, echt und persönlich.</w:t>
             </w:r>
           </w:p>
         </w:tc>
@@ -15533,7 +15533,7 @@
                 <w:sz w:val="17"/>
                 <w:szCs w:val="17"/>
               </w:rPr>
-              <w:t xml:space="preserve">Bereitet auf ein konkretes Gespräch vor — mit Botschaften, Einwänden, Taktik.</w:t>
+              <w:t xml:space="preserve">Bereitet auf ein konkretes Gespräch vor, mit Botschaften, Einwänden, Taktik.</w:t>
             </w:r>
           </w:p>
         </w:tc>
@@ -15791,7 +15791,7 @@
                 <w:sz w:val="17"/>
                 <w:szCs w:val="17"/>
               </w:rPr>
-              <w:t xml:space="preserve">Simuliert kritische Gegenfragen — übt Antworten auf schwierige Situationen.</w:t>
+              <w:t xml:space="preserve">Simuliert kritische Gegenfragen, übt Antworten auf schwierige Situationen.</w:t>
             </w:r>
           </w:p>
         </w:tc>
@@ -15920,7 +15920,7 @@
                 <w:sz w:val="17"/>
                 <w:szCs w:val="17"/>
               </w:rPr>
-              <w:t xml:space="preserve">Strukturiert die Reflexion nach einem Gespräch — was lief gut, was verbessern.</w:t>
+              <w:t xml:space="preserve">Strukturiert die Reflexion nach einem Gespräch, was lief gut, was verbessern.</w:t>
             </w:r>
           </w:p>
         </w:tc>
@@ -16117,7 +16117,7 @@
           <w:sz w:val="20"/>
           <w:szCs w:val="20"/>
         </w:rPr>
-        <w:t xml:space="preserve">Module für diesen Klienten — Auswahl im Gespräch</w:t>
+        <w:t xml:space="preserve">Module für diesen Klienten: Auswahl im Gespräch</w:t>
       </w:r>
     </w:p>
     <w:tbl>
@@ -16923,7 +16923,7 @@
                 <w:sz w:val="20"/>
                 <w:szCs w:val="20"/>
               </w:rPr>
-              <w:t xml:space="preserve">Brand Voice erfassen — kurzes Briefing oder bestehende Texte mitbringen</w:t>
+              <w:t xml:space="preserve">Brand Voice erarbeiten: im Workshop «Die Stimme finden» oder aus mitgebrachten Texten</w:t>
             </w:r>
           </w:p>
         </w:tc>
@@ -17002,7 +17002,7 @@
                 <w:sz w:val="20"/>
                 <w:szCs w:val="20"/>
               </w:rPr>
-              <w:t xml:space="preserve">Ausgewählte Module freischalten — dauert 2 Minuten in der Plattform</w:t>
+              <w:t xml:space="preserve">Ausgewählte Module freischalten, direkt in der Plattform</w:t>
             </w:r>
           </w:p>
         </w:tc>
@@ -17081,7 +17081,7 @@
                 <w:sz w:val="20"/>
                 <w:szCs w:val="20"/>
               </w:rPr>
-              <w:t xml:space="preserve">Erstes Modul gemeinsam ausprobieren — mit einem echten aktuellen Text</w:t>
+              <w:t xml:space="preserve">Erstes Modul gemeinsam ausprobieren, mit einem echten aktuellen Text</w:t>
             </w:r>
           </w:p>
         </w:tc>
@@ -17160,7 +17160,7 @@
                 <w:sz w:val="20"/>
                 <w:szCs w:val="20"/>
               </w:rPr>
-              <w:t xml:space="preserve">Feedback nach 2 Wochen — was funktioniert, was passen wir an?</w:t>
+              <w:t xml:space="preserve">Feedback nach 2 Wochen: Was funktioniert, was passen wir an?</w:t>
             </w:r>
           </w:p>
         </w:tc>
@@ -17246,7 +17246,7 @@
                 <w:sz w:val="20"/>
                 <w:szCs w:val="20"/>
               </w:rPr>
-              <w:t xml:space="preserve">Am Ende dieses Gesprächs wissen wir: Welche 5–8 Module starten wir? Was ist Ihr häufigstes Kommunikationsszenario? Wie klingt Ihre Brand Voice in drei Sätzen?</w:t>
+              <w:t xml:space="preserve">Am Ende dieses Gesprächs wissen wir: Welche 5 bis 8 Module starten wir? Was ist Ihr häufigstes Kommunikationsszenario? Wie klingt Ihre Brand Voice in drei Sätzen?</w:t>
             </w:r>
           </w:p>
         </w:tc>
@@ -17295,7 +17295,7 @@
           <w:sz w:val="18"/>
           <w:szCs w:val="18"/>
         </w:rPr>
-        <w:t xml:space="preserve">Lorena Alienhard  ·  contact@lorenalienhard.ch  ·  RhetorIQ</w:t>
+        <w:t xml:space="preserve">Lorena Lienhard  ·  contact@lorenalienhard.ch  ·  RhetorIQ</w:t>
       </w:r>
     </w:p>
     <w:sectPr>

</xml_diff>